<commit_message>
Affiliations: Florida Atlantic University (campus only); record the reserved data DOI
Matches the Zenodo data record (10.5281/zenodo.22928016, reserved). Affiliation accuracy
is the authors' to confirm with the university; consistency across the paper, the record
and ORCID is what this commit fixes.

Co-Authored-By: Claude Opus 5 <noreply@anthropic.com>
</commit_message>
<xml_diff>
--- a/docs/manuscript/MANUSCRIPT_v2.0.docx
+++ b/docs/manuscript/MANUSCRIPT_v2.0.docx
@@ -96,7 +96,7 @@
           <w:sz w:val="20"/>
           <w:szCs w:val="20"/>
         </w:rPr>
-        <w:t xml:space="preserve">¹ FAU High School, Florida Atlantic University, Jupiter, FL, USA</w:t>
+        <w:t xml:space="preserve">¹ Florida Atlantic University, Jupiter, FL, USA</w:t>
       </w:r>
     </w:p>
     <w:p>
@@ -109,7 +109,7 @@
           <w:sz w:val="20"/>
           <w:szCs w:val="20"/>
         </w:rPr>
-        <w:t xml:space="preserve">² FAU High School, Florida Atlantic University, Boca Raton, FL, USA</w:t>
+        <w:t xml:space="preserve">² Florida Atlantic University, Boca Raton, FL, USA</w:t>
       </w:r>
     </w:p>
     <w:p>
@@ -1609,7 +1609,7 @@
           <w:sz w:val="20"/>
           <w:szCs w:val="20"/>
         </w:rPr>
-        <w:t xml:space="preserve">NexClamp, the software used for every step of this study, is open-source under the Apache-2.0 licence and is distributed from a public repository ([repository URL]) with installation and usage documentation; the exact version that produced the results reported here is archived with a persistent identifier ([Zenodo DOI], version 0.2.0.dev0). The frozen study configuration, the model manifest with per-model licences and pinned upstream commits, the preregistration record, every per-variant record (edits, classifications, detections, tolerances), the analysis outputs, and the scripts that regenerate every table and figure in this article are included in that archive. The complete raw simulation output of the confirmatory campaign (17,424 files, 4.1 GB, including all voltage traces) is deposited as a separate archived dataset ([Zenodo data DOI]) together with the SHA-256 manifest that verifies it. The preregistration is publicly readable at https://aspredicted.org/q2ag7w.pdf (AsPredicted #312455).</w:t>
+        <w:t xml:space="preserve">NexClamp, the software used for every step of this study, is open-source under the Apache-2.0 licence and is distributed from a public repository (https://github.com/neelgurram/nexclamp) with installation and usage documentation; the exact version that produced the results reported here is archived with a persistent identifier ([Zenodo DOI], version 0.2.0.dev0). The frozen study configuration, the model manifest with per-model licences and pinned upstream commits, the preregistration record, every per-variant record (edits, classifications, detections, tolerances), the analysis outputs, and the scripts that regenerate every table and figure in this article are included in that archive. The complete raw simulation output of the confirmatory campaign (17,424 files, 4.1 GB, including all voltage traces) is deposited as a separate archived dataset (https://doi.org/10.5281/zenodo.22928016) together with the SHA-256 manifest that verifies it. The preregistration is publicly readable at https://aspredicted.org/q2ag7w.pdf (AsPredicted #312455).</w:t>
       </w:r>
     </w:p>
     <w:p>
@@ -1776,7 +1776,7 @@
           <w:sz w:val="20"/>
           <w:szCs w:val="20"/>
         </w:rPr>
-        <w:t xml:space="preserve"> All data supporting the results are publicly archived as described in the Information Sharing Statement: derived per-variant records and analysis outputs in the software and results archive ([Zenodo DOI]), and the complete raw simulation output in the dataset archive ([Zenodo data DOI]). No restrictions apply.</w:t>
+        <w:t xml:space="preserve"> All data supporting the results are publicly archived as described in the Information Sharing Statement: derived per-variant records and analysis outputs in the software and results archive ([Zenodo DOI]), and the complete raw simulation output in the dataset archive (https://doi.org/10.5281/zenodo.22928016). No restrictions apply.</w:t>
       </w:r>
     </w:p>
     <w:p>
@@ -1799,7 +1799,7 @@
           <w:sz w:val="20"/>
           <w:szCs w:val="20"/>
         </w:rPr>
-        <w:t xml:space="preserve"> NexClamp is available under Apache-2.0 at [repository URL] and archived at [Zenodo DOI]. The exact commit, configuration hashes and environment used for the confirmatory campaign are recorded in the archive and in Online Resource 1.</w:t>
+        <w:t xml:space="preserve"> NexClamp is available under Apache-2.0 at https://github.com/neelgurram/nexclamp and archived at [Zenodo DOI]. The exact commit, configuration hashes and environment used for the confirmatory campaign are recorded in the archive and in Online Resource 1.</w:t>
       </w:r>
     </w:p>
     <w:p>

</xml_diff>

<commit_message>
Rebuild the Word manuscript with the audit section
Co-Authored-By: Claude Opus 5 <noreply@anthropic.com>
</commit_message>
<xml_diff>
--- a/docs/manuscript/MANUSCRIPT_v2.0.docx
+++ b/docs/manuscript/MANUSCRIPT_v2.0.docx
@@ -1393,7 +1393,161 @@
           <w:sz w:val="20"/>
           <w:szCs w:val="20"/>
         </w:rPr>
-        <w:t xml:space="preserve">An automated re-check re-derived, from the raw files rather than the pipeline's summaries, the edit, the class and every detection for 25 faults (a preregistered random sample of 20 plus the six canonical survivors, one of which fell in both). For each, the differences between the edited and unmodified model files were exactly the recorded edit and matched the operator's declared meaning; the class re-derived correctly; all recorded feature detections recomputed from the per-run feature files; spike-count detections were confirmed by recounting spikes directly from the stored voltage traces; and all 227 full-trace detections recomputed. [The independent human audit of the same faults by two authors is in progress; its results and any disagreements will be reported here.]</w:t>
+        <w:t xml:space="preserve">Two kinds of check were applied to a sample of 25 faults: the preregistered random sample of 20 plus the six canonical survivors, one of which fell in both.</w:t>
+      </w:r>
+    </w:p>
+    <w:p>
+      <w:pPr>
+        <w:spacing w:after="120" w:line="360"/>
+      </w:pPr>
+      <w:r>
+        <w:rPr>
+          <w:rFonts w:ascii="Times New Roman" w:cs="Times New Roman" w:eastAsia="Times New Roman" w:hAnsi="Times New Roman"/>
+          <w:b/>
+          <w:bCs/>
+          <w:sz w:val="20"/>
+          <w:szCs w:val="20"/>
+        </w:rPr>
+        <w:t xml:space="preserve">Automated re-check.</w:t>
+      </w:r>
+      <w:r>
+        <w:rPr>
+          <w:rFonts w:ascii="Times New Roman" w:cs="Times New Roman" w:eastAsia="Times New Roman" w:hAnsi="Times New Roman"/>
+          <w:sz w:val="20"/>
+          <w:szCs w:val="20"/>
+        </w:rPr>
+        <w:t xml:space="preserve"> Working from the raw files rather than the pipeline's summaries, the edit, the class and every detection were re-derived for all 25. For each fault, the differences between the edited and the unmodified model files were exactly the recorded edit and matched the operator's declared meaning; the class re-derived correctly; all recorded feature detections recomputed from the per-run feature files; spike-count detections were confirmed by recounting spikes directly from the stored voltage traces; and all 227 full-trace detections recomputed.</w:t>
+      </w:r>
+    </w:p>
+    <w:p>
+      <w:pPr>
+        <w:spacing w:after="120" w:line="360"/>
+      </w:pPr>
+      <w:r>
+        <w:rPr>
+          <w:rFonts w:ascii="Times New Roman" w:cs="Times New Roman" w:eastAsia="Times New Roman" w:hAnsi="Times New Roman"/>
+          <w:b/>
+          <w:bCs/>
+          <w:sz w:val="20"/>
+          <w:szCs w:val="20"/>
+        </w:rPr>
+        <w:t xml:space="preserve">Human audit.</w:t>
+      </w:r>
+      <w:r>
+        <w:rPr>
+          <w:rFonts w:ascii="Times New Roman" w:cs="Times New Roman" w:eastAsia="Times New Roman" w:hAnsi="Times New Roman"/>
+          <w:sz w:val="20"/>
+          <w:szCs w:val="20"/>
+        </w:rPr>
+        <w:t xml:space="preserve"> Two of the authors audited the same 25 faults from a self-contained packet containing, for each fault, the exact before-and-after lines of the edited model file, the recorded evidence and a plot of the original against the edited model. They answered three questions per fault: whether the edit matches its label, whether the assigned class is plausible, and whether the detection is plausible. The returned packets, the extracted verdicts and the auditors' notes are published with the data.</w:t>
+      </w:r>
+    </w:p>
+    <w:p>
+      <w:pPr>
+        <w:spacing w:after="120" w:line="360"/>
+      </w:pPr>
+      <w:r>
+        <w:rPr>
+          <w:rFonts w:ascii="Times New Roman" w:cs="Times New Roman" w:eastAsia="Times New Roman" w:hAnsi="Times New Roman"/>
+          <w:sz w:val="20"/>
+          <w:szCs w:val="20"/>
+        </w:rPr>
+        <w:t xml:space="preserve">Neither auditor judged any edit to be mislabelled (Q1: 41 of 50 answers "yes", 9 "unsure", none "no") or any class implausible except one marking discussed below (Q2: 47 "yes", 2 "unsure", 1 "no"). The two auditors gave identical verdicts on 24 of 25 faults for each question. Their reservations fell into three groups.</w:t>
+      </w:r>
+    </w:p>
+    <w:p>
+      <w:pPr>
+        <w:spacing w:after="120" w:line="360"/>
+      </w:pPr>
+      <w:r>
+        <w:rPr>
+          <w:rFonts w:ascii="Times New Roman" w:cs="Times New Roman" w:eastAsia="Times New Roman" w:hAnsi="Times New Roman"/>
+          <w:i/>
+          <w:iCs/>
+          <w:sz w:val="20"/>
+          <w:szCs w:val="20"/>
+        </w:rPr>
+        <w:t xml:space="preserve">Mechanism wording.</w:t>
+      </w:r>
+      <w:r>
+        <w:rPr>
+          <w:rFonts w:ascii="Times New Roman" w:cs="Times New Roman" w:eastAsia="Times New Roman" w:hAnsi="Times New Roman"/>
+          <w:sz w:val="20"/>
+          <w:szCs w:val="20"/>
+        </w:rPr>
+        <w:t xml:space="preserve"> Four "unsure" answers concern the gate-time-constant operator, which scales a gate's rates through a Q10 setting rather than multiplying the time constant directly, so neither auditor could confirm the exact factor from the edit alone. One further "unsure" concerns a 10 mV reversal-potential shift described in the packet as "a few mV". Both are descriptions in the audit materials rather than defects in the faults; the mechanism is documented and the implementation was confirmed by the automated re-check. We have revised both descriptions.</w:t>
+      </w:r>
+    </w:p>
+    <w:p>
+      <w:pPr>
+        <w:spacing w:after="120" w:line="360"/>
+      </w:pPr>
+      <w:r>
+        <w:rPr>
+          <w:rFonts w:ascii="Times New Roman" w:cs="Times New Roman" w:eastAsia="Times New Roman" w:hAnsi="Times New Roman"/>
+          <w:i/>
+          <w:iCs/>
+          <w:sz w:val="20"/>
+          <w:szCs w:val="20"/>
+        </w:rPr>
+        <w:t xml:space="preserve">An option the form lacked in practice.</w:t>
+      </w:r>
+      <w:r>
+        <w:rPr>
+          <w:rFonts w:ascii="Times New Roman" w:cs="Times New Roman" w:eastAsia="Times New Roman" w:hAnsi="Times New Roman"/>
+          <w:sz w:val="20"/>
+          <w:szCs w:val="20"/>
+        </w:rPr>
+        <w:t xml:space="preserve"> Most "no" answers to the detection question fall on faults with no recorded detection at all, where the intended answer was "not applicable"; one auditor wrote "Q3 is N/A" while marking "no". These are therefore not disputes about the evidence. The form offered "not applicable" only for that question and the instruction was evidently not clear enough.</w:t>
+      </w:r>
+    </w:p>
+    <w:p>
+      <w:pPr>
+        <w:spacing w:after="120" w:line="360"/>
+      </w:pPr>
+      <w:r>
+        <w:rPr>
+          <w:rFonts w:ascii="Times New Roman" w:cs="Times New Roman" w:eastAsia="Times New Roman" w:hAnsi="Times New Roman"/>
+          <w:i/>
+          <w:iCs/>
+          <w:sz w:val="20"/>
+          <w:szCs w:val="20"/>
+        </w:rPr>
+        <w:t xml:space="preserve">Two substantive flags, both checked.</w:t>
+      </w:r>
+      <w:r>
+        <w:rPr>
+          <w:rFonts w:ascii="Times New Roman" w:cs="Times New Roman" w:eastAsia="Times New Roman" w:hAnsi="Times New Roman"/>
+          <w:sz w:val="20"/>
+          <w:szCs w:val="20"/>
+        </w:rPr>
+        <w:t xml:space="preserve"> Both auditors noticed feature rows whose tolerance is infinite and judged, correctly, that such a row can never be exceeded. Seven of 342 tolerance entries are infinite, all of them where the feature is undefined in the reference at both step sizes (for example, first-spike latency on a protocol in which the reference does not spike). Those rows are reached only through the preregistered definedness rule, under which a feature defined in one model and undefined in the other counts as a difference: all 24 detections involving such a row are definedness mismatches and none claims a numeric exceedance. One auditor also flagged a case where a 5 mV reversal shift produced a very large change in interspike interval as disproportionate; the model's persistent sodium conductance makes this plausible, and the detection reproduced at both step sizes.</w:t>
+      </w:r>
+    </w:p>
+    <w:p>
+      <w:pPr>
+        <w:spacing w:after="120" w:line="360"/>
+      </w:pPr>
+      <w:r>
+        <w:rPr>
+          <w:rFonts w:ascii="Times New Roman" w:cs="Times New Roman" w:eastAsia="Times New Roman" w:hAnsi="Times New Roman"/>
+          <w:sz w:val="20"/>
+          <w:szCs w:val="20"/>
+        </w:rPr>
+        <w:t xml:space="preserve">One marking is unresolved: on a numerical stress test, one auditor marked the class implausible while writing that the class "is satisfied". We report the marking as returned rather than reinterpreting it. [Awaiting that auditor's confirmation before submission.]</w:t>
+      </w:r>
+    </w:p>
+    <w:p>
+      <w:pPr>
+        <w:spacing w:after="120" w:line="360"/>
+      </w:pPr>
+      <w:r>
+        <w:rPr>
+          <w:rFonts w:ascii="Times New Roman" w:cs="Times New Roman" w:eastAsia="Times New Roman" w:hAnsi="Times New Roman"/>
+          <w:sz w:val="20"/>
+          <w:szCs w:val="20"/>
+        </w:rPr>
+        <w:t xml:space="preserve">[Both auditors answered "no" to the packet's statement "I worked alone and did not see the automated check". Before submission we will state exactly what this means for the independence of the audit, and describe it accurately rather than as a fully independent replication.]</w:t>
       </w:r>
     </w:p>
     <w:p>
@@ -1522,7 +1676,7 @@
           <w:sz w:val="20"/>
           <w:szCs w:val="20"/>
         </w:rPr>
-        <w:t xml:space="preserve">The evaluation used six models from four source families, so the intervals are wide and the model-level permutation test is underpowered by construction; the interval for Δ excludes zero but does not establish a material advantage. All models are single-compartment, so dendritic faults were out of scope. The faults were evaluated in a single simulator, although every held-out model's reference behaviour reproduced in NEURON (Section 3.7). Faults were synthetic single-site edits; real modification errors may be larger, compound or correlated. Admissibility depends on the definition used (82 at feature level, 94 including trace-only changes), and both are reported. The result for the held-out kinetics family is inconclusive. The frozen generator produced 186 variants against a preregistered estimate of roughly 100 to 150, and selection produced a three-protocol battery under a four-protocol budget; both are reported as they occurred. [The human audit is in progress.]</w:t>
+        <w:t xml:space="preserve">The evaluation used six models from four source families, so the intervals are wide and the model-level permutation test is underpowered by construction; the interval for Δ excludes zero but does not establish a material advantage. All models are single-compartment, so dendritic faults were out of scope. The faults were evaluated in a single simulator, although every held-out model's reference behaviour reproduced in NEURON (Section 3.7). Faults were synthetic single-site edits; real modification errors may be larger, compound or correlated. Admissibility depends on the definition used (82 at feature level, 94 including trace-only changes), and both are reported. The result for the held-out kinetics family is inconclusive. The frozen generator produced 186 variants against a preregistered estimate of roughly 100 to 150, and selection produced a three-protocol battery under a four-protocol budget; both are reported as they occurred. The human audit found no mislabelled edit and no misclassified fault, but it was carried out by two of the authors rather than by people outside the study, and its independence is qualified as described in Section 3.8.</w:t>
       </w:r>
     </w:p>
     <w:p>
@@ -2937,7 +3091,7 @@
           <wp:inline distT="0" distB="0" distL="0" distR="0">
             <wp:extent cx="5905500" cy="3314700"/>
             <wp:effectExtent t="0" r="0" b="0" l="0"/>
-            <wp:docPr id="1" name="" descr="" title=""/>
+            <wp:docPr id="2" name="" descr="" title=""/>
             <wp:cNvGraphicFramePr>
               <a:graphicFrameLocks xmlns:a="http://schemas.openxmlformats.org/drawingml/2006/main" noChangeAspect="1"/>
             </wp:cNvGraphicFramePr>
@@ -3006,7 +3160,7 @@
           <wp:inline distT="0" distB="0" distL="0" distR="0">
             <wp:extent cx="5905500" cy="3171825"/>
             <wp:effectExtent t="0" r="0" b="0" l="0"/>
-            <wp:docPr id="1" name="" descr="" title=""/>
+            <wp:docPr id="3" name="" descr="" title=""/>
             <wp:cNvGraphicFramePr>
               <a:graphicFrameLocks xmlns:a="http://schemas.openxmlformats.org/drawingml/2006/main" noChangeAspect="1"/>
             </wp:cNvGraphicFramePr>
@@ -3075,7 +3229,7 @@
           <wp:inline distT="0" distB="0" distL="0" distR="0">
             <wp:extent cx="5905500" cy="2733675"/>
             <wp:effectExtent t="0" r="0" b="0" l="0"/>
-            <wp:docPr id="1" name="" descr="" title=""/>
+            <wp:docPr id="4" name="" descr="" title=""/>
             <wp:cNvGraphicFramePr>
               <a:graphicFrameLocks xmlns:a="http://schemas.openxmlformats.org/drawingml/2006/main" noChangeAspect="1"/>
             </wp:cNvGraphicFramePr>
@@ -3208,7 +3362,7 @@
           <wp:inline distT="0" distB="0" distL="0" distR="0">
             <wp:extent cx="5905500" cy="3133725"/>
             <wp:effectExtent t="0" r="0" b="0" l="0"/>
-            <wp:docPr id="1" name="" descr="" title=""/>
+            <wp:docPr id="5" name="" descr="" title=""/>
             <wp:cNvGraphicFramePr>
               <a:graphicFrameLocks xmlns:a="http://schemas.openxmlformats.org/drawingml/2006/main" noChangeAspect="1"/>
             </wp:cNvGraphicFramePr>
@@ -3451,7 +3605,7 @@
       </w:tr>
       <w:tr>
         <w:trPr>
-          <w:tblHeader w:val="false"/>
+          <w:tblHeader w:val="off"/>
         </w:trPr>
         <w:tc>
           <w:tcPr>
@@ -3572,7 +3726,7 @@
       </w:tr>
       <w:tr>
         <w:trPr>
-          <w:tblHeader w:val="false"/>
+          <w:tblHeader w:val="off"/>
         </w:trPr>
         <w:tc>
           <w:tcPr>
@@ -3693,7 +3847,7 @@
       </w:tr>
       <w:tr>
         <w:trPr>
-          <w:tblHeader w:val="false"/>
+          <w:tblHeader w:val="off"/>
         </w:trPr>
         <w:tc>
           <w:tcPr>
@@ -3814,7 +3968,7 @@
       </w:tr>
       <w:tr>
         <w:trPr>
-          <w:tblHeader w:val="false"/>
+          <w:tblHeader w:val="off"/>
         </w:trPr>
         <w:tc>
           <w:tcPr>
@@ -3935,7 +4089,7 @@
       </w:tr>
       <w:tr>
         <w:trPr>
-          <w:tblHeader w:val="false"/>
+          <w:tblHeader w:val="off"/>
         </w:trPr>
         <w:tc>
           <w:tcPr>
@@ -4056,7 +4210,7 @@
       </w:tr>
       <w:tr>
         <w:trPr>
-          <w:tblHeader w:val="false"/>
+          <w:tblHeader w:val="off"/>
         </w:trPr>
         <w:tc>
           <w:tcPr>
@@ -4324,7 +4478,7 @@
       </w:tr>
       <w:tr>
         <w:trPr>
-          <w:tblHeader w:val="false"/>
+          <w:tblHeader w:val="off"/>
         </w:trPr>
         <w:tc>
           <w:tcPr>
@@ -4387,7 +4541,7 @@
       </w:tr>
       <w:tr>
         <w:trPr>
-          <w:tblHeader w:val="false"/>
+          <w:tblHeader w:val="off"/>
         </w:trPr>
         <w:tc>
           <w:tcPr>
@@ -4450,7 +4604,7 @@
       </w:tr>
       <w:tr>
         <w:trPr>
-          <w:tblHeader w:val="false"/>
+          <w:tblHeader w:val="off"/>
         </w:trPr>
         <w:tc>
           <w:tcPr>
@@ -4513,7 +4667,7 @@
       </w:tr>
       <w:tr>
         <w:trPr>
-          <w:tblHeader w:val="false"/>
+          <w:tblHeader w:val="off"/>
         </w:trPr>
         <w:tc>
           <w:tcPr>
@@ -4576,7 +4730,7 @@
       </w:tr>
       <w:tr>
         <w:trPr>
-          <w:tblHeader w:val="false"/>
+          <w:tblHeader w:val="off"/>
         </w:trPr>
         <w:tc>
           <w:tcPr>
@@ -4639,7 +4793,7 @@
       </w:tr>
       <w:tr>
         <w:trPr>
-          <w:tblHeader w:val="false"/>
+          <w:tblHeader w:val="off"/>
         </w:trPr>
         <w:tc>
           <w:tcPr>
@@ -4874,7 +5028,7 @@
       </w:tr>
       <w:tr>
         <w:trPr>
-          <w:tblHeader w:val="false"/>
+          <w:tblHeader w:val="off"/>
         </w:trPr>
         <w:tc>
           <w:tcPr>
@@ -5005,7 +5159,7 @@
       </w:tr>
       <w:tr>
         <w:trPr>
-          <w:tblHeader w:val="false"/>
+          <w:tblHeader w:val="off"/>
         </w:trPr>
         <w:tc>
           <w:tcPr>
@@ -5136,7 +5290,7 @@
       </w:tr>
       <w:tr>
         <w:trPr>
-          <w:tblHeader w:val="false"/>
+          <w:tblHeader w:val="off"/>
         </w:trPr>
         <w:tc>
           <w:tcPr>
@@ -5267,7 +5421,7 @@
       </w:tr>
       <w:tr>
         <w:trPr>
-          <w:tblHeader w:val="false"/>
+          <w:tblHeader w:val="off"/>
         </w:trPr>
         <w:tc>
           <w:tcPr>
@@ -5398,7 +5552,7 @@
       </w:tr>
       <w:tr>
         <w:trPr>
-          <w:tblHeader w:val="false"/>
+          <w:tblHeader w:val="off"/>
         </w:trPr>
         <w:tc>
           <w:tcPr>
@@ -5529,7 +5683,7 @@
       </w:tr>
       <w:tr>
         <w:trPr>
-          <w:tblHeader w:val="false"/>
+          <w:tblHeader w:val="off"/>
         </w:trPr>
         <w:tc>
           <w:tcPr>
@@ -5832,7 +5986,7 @@
       </w:tr>
       <w:tr>
         <w:trPr>
-          <w:tblHeader w:val="false"/>
+          <w:tblHeader w:val="off"/>
         </w:trPr>
         <w:tc>
           <w:tcPr>
@@ -5953,7 +6107,7 @@
       </w:tr>
       <w:tr>
         <w:trPr>
-          <w:tblHeader w:val="false"/>
+          <w:tblHeader w:val="off"/>
         </w:trPr>
         <w:tc>
           <w:tcPr>
@@ -6074,7 +6228,7 @@
       </w:tr>
       <w:tr>
         <w:trPr>
-          <w:tblHeader w:val="false"/>
+          <w:tblHeader w:val="off"/>
         </w:trPr>
         <w:tc>
           <w:tcPr>
@@ -6195,7 +6349,7 @@
       </w:tr>
       <w:tr>
         <w:trPr>
-          <w:tblHeader w:val="false"/>
+          <w:tblHeader w:val="off"/>
         </w:trPr>
         <w:tc>
           <w:tcPr>
@@ -6316,7 +6470,7 @@
       </w:tr>
       <w:tr>
         <w:trPr>
-          <w:tblHeader w:val="false"/>
+          <w:tblHeader w:val="off"/>
         </w:trPr>
         <w:tc>
           <w:tcPr>
@@ -6437,7 +6591,7 @@
       </w:tr>
       <w:tr>
         <w:trPr>
-          <w:tblHeader w:val="false"/>
+          <w:tblHeader w:val="off"/>
         </w:trPr>
         <w:tc>
           <w:tcPr>
@@ -6558,7 +6712,7 @@
       </w:tr>
       <w:tr>
         <w:trPr>
-          <w:tblHeader w:val="false"/>
+          <w:tblHeader w:val="off"/>
         </w:trPr>
         <w:tc>
           <w:tcPr>
@@ -6679,7 +6833,7 @@
       </w:tr>
       <w:tr>
         <w:trPr>
-          <w:tblHeader w:val="false"/>
+          <w:tblHeader w:val="off"/>
         </w:trPr>
         <w:tc>
           <w:tcPr>
@@ -6800,7 +6954,7 @@
       </w:tr>
       <w:tr>
         <w:trPr>
-          <w:tblHeader w:val="false"/>
+          <w:tblHeader w:val="off"/>
         </w:trPr>
         <w:tc>
           <w:tcPr>
@@ -6921,7 +7075,7 @@
       </w:tr>
       <w:tr>
         <w:trPr>
-          <w:tblHeader w:val="false"/>
+          <w:tblHeader w:val="off"/>
         </w:trPr>
         <w:tc>
           <w:tcPr>
@@ -7047,7 +7201,7 @@
       </w:pPr>
     </w:p>
     <w:sectPr>
-      <w:footerReference w:type="default" r:id="rId7"/>
+      <w:footerReference w:type="default" r:id="rId6"/>
       <w:pgSz w:w="12240" w:h="15840" w:orient="portrait"/>
       <w:pgMar w:top="1440" w:right="1440" w:bottom="1440" w:left="1440" w:header="708" w:footer="708" w:gutter="0"/>
       <w:lnNumType w:countBy="1" w:restart="continuous"/>
@@ -7056,10 +7210,6 @@
     </w:sectPr>
   </w:body>
 </w:document>
-</file>
-
-<file path=word/comments.xml><?xml version="1.0" encoding="utf-8"?>
-<w:comments xmlns:cx="http://schemas.microsoft.com/office/drawing/2014/chartex" xmlns:cx1="http://schemas.microsoft.com/office/drawing/2015/9/8/chartex" xmlns:cx2="http://schemas.microsoft.com/office/drawing/2015/10/21/chartex" xmlns:cx3="http://schemas.microsoft.com/office/drawing/2016/5/9/chartex" xmlns:cx4="http://schemas.microsoft.com/office/drawing/2016/5/10/chartex" xmlns:cx5="http://schemas.microsoft.com/office/drawing/2016/5/11/chartex" xmlns:cx6="http://schemas.microsoft.com/office/drawing/2016/5/12/chartex" xmlns:cx7="http://schemas.microsoft.com/office/drawing/2016/5/13/chartex" xmlns:cx8="http://schemas.microsoft.com/office/drawing/2016/5/14/chartex" xmlns:mc="http://schemas.openxmlformats.org/markup-compatibility/2006" xmlns:aink="http://schemas.microsoft.com/office/drawing/2016/ink" xmlns:am3d="http://schemas.microsoft.com/office/drawing/2017/model3d" xmlns:o="urn:schemas-microsoft-com:office:office" xmlns:r="http://schemas.openxmlformats.org/officeDocument/2006/relationships" xmlns:m="http://schemas.openxmlformats.org/officeDocument/2006/math" xmlns:v="urn:schemas-microsoft-com:vml" xmlns:wp14="http://schemas.microsoft.com/office/word/2010/wordprocessingDrawing" xmlns:wp="http://schemas.openxmlformats.org/drawingml/2006/wordprocessingDrawing" xmlns:w10="urn:schemas-microsoft-com:office:word" xmlns:w="http://schemas.openxmlformats.org/wordprocessingml/2006/main" xmlns:w14="http://schemas.microsoft.com/office/word/2010/wordml" xmlns:w15="http://schemas.microsoft.com/office/word/2012/wordml" xmlns:w16cex="http://schemas.microsoft.com/office/word/2018/wordml/cex" xmlns:w16cid="http://schemas.microsoft.com/office/word/2016/wordml/cid" xmlns:w16="http://schemas.microsoft.com/office/word/2018/wordml" xmlns:w16sdtdh="http://schemas.microsoft.com/office/word/2020/wordml/sdtdatahash" xmlns:w16se="http://schemas.microsoft.com/office/word/2015/wordml/symex" xmlns:wpg="http://schemas.microsoft.com/office/word/2010/wordprocessingGroup" xmlns:wpi="http://schemas.microsoft.com/office/word/2010/wordprocessingInk" xmlns:wne="http://schemas.microsoft.com/office/word/2006/wordml" xmlns:wps="http://schemas.microsoft.com/office/word/2010/wordprocessingShape"/>
 </file>
 
 <file path=word/endnotes.xml><?xml version="1.0" encoding="utf-8"?>
@@ -7161,7 +7311,7 @@
 <w:numbering xmlns:wpc="http://schemas.microsoft.com/office/word/2010/wordprocessingCanvas" xmlns:mc="http://schemas.openxmlformats.org/markup-compatibility/2006" xmlns:o="urn:schemas-microsoft-com:office:office" xmlns:r="http://schemas.openxmlformats.org/officeDocument/2006/relationships" xmlns:m="http://schemas.openxmlformats.org/officeDocument/2006/math" xmlns:v="urn:schemas-microsoft-com:vml" xmlns:wp14="http://schemas.microsoft.com/office/word/2010/wordprocessingDrawing" xmlns:wp="http://schemas.openxmlformats.org/drawingml/2006/wordprocessingDrawing" xmlns:w10="urn:schemas-microsoft-com:office:word" xmlns:w="http://schemas.openxmlformats.org/wordprocessingml/2006/main" xmlns:w14="http://schemas.microsoft.com/office/word/2010/wordml" xmlns:w15="http://schemas.microsoft.com/office/word/2012/wordml" xmlns:wpg="http://schemas.microsoft.com/office/word/2010/wordprocessingGroup" xmlns:wpi="http://schemas.microsoft.com/office/word/2010/wordprocessingInk" xmlns:wne="http://schemas.microsoft.com/office/word/2006/wordml" xmlns:wps="http://schemas.microsoft.com/office/word/2010/wordprocessingShape" mc:Ignorable="w14 w15 wp14">
   <w:abstractNum w:abstractNumId="1" w15:restartNumberingAfterBreak="0">
     <w:multiLevelType w:val="hybridMultilevel"/>
-    <w:lvl w:ilvl="0" w15:tentative="1">
+    <w:lvl w:ilvl="0" w:tentative="1">
       <w:start w:val="1"/>
       <w:numFmt w:val="bullet"/>
       <w:lvlText w:val="●"/>
@@ -7170,7 +7320,7 @@
         <w:ind w:left="720" w:hanging="360"/>
       </w:pPr>
     </w:lvl>
-    <w:lvl w:ilvl="1" w15:tentative="1">
+    <w:lvl w:ilvl="1" w:tentative="1">
       <w:start w:val="1"/>
       <w:numFmt w:val="bullet"/>
       <w:lvlText w:val="○"/>
@@ -7179,7 +7329,7 @@
         <w:ind w:left="1440" w:hanging="360"/>
       </w:pPr>
     </w:lvl>
-    <w:lvl w:ilvl="2" w15:tentative="1">
+    <w:lvl w:ilvl="2" w:tentative="1">
       <w:start w:val="1"/>
       <w:numFmt w:val="bullet"/>
       <w:lvlText w:val="■"/>
@@ -7188,7 +7338,7 @@
         <w:ind w:left="2160" w:hanging="360"/>
       </w:pPr>
     </w:lvl>
-    <w:lvl w:ilvl="3" w15:tentative="1">
+    <w:lvl w:ilvl="3" w:tentative="1">
       <w:start w:val="1"/>
       <w:numFmt w:val="bullet"/>
       <w:lvlText w:val="●"/>
@@ -7197,7 +7347,7 @@
         <w:ind w:left="2880" w:hanging="360"/>
       </w:pPr>
     </w:lvl>
-    <w:lvl w:ilvl="4" w15:tentative="1">
+    <w:lvl w:ilvl="4" w:tentative="1">
       <w:start w:val="1"/>
       <w:numFmt w:val="bullet"/>
       <w:lvlText w:val="○"/>
@@ -7206,7 +7356,7 @@
         <w:ind w:left="3600" w:hanging="360"/>
       </w:pPr>
     </w:lvl>
-    <w:lvl w:ilvl="5" w15:tentative="1">
+    <w:lvl w:ilvl="5" w:tentative="1">
       <w:start w:val="1"/>
       <w:numFmt w:val="bullet"/>
       <w:lvlText w:val="■"/>
@@ -7215,7 +7365,7 @@
         <w:ind w:left="4320" w:hanging="360"/>
       </w:pPr>
     </w:lvl>
-    <w:lvl w:ilvl="6" w15:tentative="1">
+    <w:lvl w:ilvl="6" w:tentative="1">
       <w:start w:val="1"/>
       <w:numFmt w:val="bullet"/>
       <w:lvlText w:val="●"/>
@@ -7224,7 +7374,7 @@
         <w:ind w:left="5040" w:hanging="360"/>
       </w:pPr>
     </w:lvl>
-    <w:lvl w:ilvl="7" w15:tentative="1">
+    <w:lvl w:ilvl="7" w:tentative="1">
       <w:start w:val="1"/>
       <w:numFmt w:val="bullet"/>
       <w:lvlText w:val="●"/>
@@ -7233,7 +7383,7 @@
         <w:ind w:left="5760" w:hanging="360"/>
       </w:pPr>
     </w:lvl>
-    <w:lvl w:ilvl="8" w15:tentative="1">
+    <w:lvl w:ilvl="8" w:tentative="1">
       <w:start w:val="1"/>
       <w:numFmt w:val="bullet"/>
       <w:lvlText w:val="●"/>
@@ -7245,7 +7395,7 @@
   </w:abstractNum>
   <w:abstractNum w:abstractNumId="2" w15:restartNumberingAfterBreak="0">
     <w:multiLevelType w:val="hybridMultilevel"/>
-    <w:lvl w:ilvl="0" w15:tentative="1">
+    <w:lvl w:ilvl="0" w:tentative="1">
       <w:start w:val="1"/>
       <w:numFmt w:val="bullet"/>
       <w:lvlText w:val="•"/>
@@ -7257,7 +7407,7 @@
   </w:abstractNum>
   <w:abstractNum w:abstractNumId="3" w15:restartNumberingAfterBreak="0">
     <w:multiLevelType w:val="hybridMultilevel"/>
-    <w:lvl w:ilvl="0" w15:tentative="1">
+    <w:lvl w:ilvl="0" w:tentative="1">
       <w:start w:val="1"/>
       <w:numFmt w:val="decimal"/>
       <w:lvlText w:val="%1."/>
@@ -7288,6 +7438,10 @@
     </w:rPrDefault>
     <w:pPrDefault/>
   </w:docDefaults>
+  <w:style w:type="paragraph" w:styleId="Normal" w:default="1">
+    <w:name w:val="Normal"/>
+    <w:qFormat/>
+  </w:style>
   <w:style w:type="paragraph" w:styleId="Title">
     <w:name w:val="Title"/>
     <w:basedOn w:val="Normal"/>
@@ -7460,4 +7614,294 @@
     </w:rPr>
   </w:style>
 </w:styles>
+</file>
+
+<file path=word/theme/theme1.xml><?xml version="1.0" encoding="utf-8"?>
+<a:theme xmlns:a="http://schemas.openxmlformats.org/drawingml/2006/main" name="Office Theme">
+  <a:themeElements>
+    <a:clrScheme name="Office">
+      <a:dk1>
+        <a:sysClr val="windowText" lastClr="000000"/>
+      </a:dk1>
+      <a:lt1>
+        <a:sysClr val="window" lastClr="FFFFFF"/>
+      </a:lt1>
+      <a:dk2>
+        <a:srgbClr val="44546A"/>
+      </a:dk2>
+      <a:lt2>
+        <a:srgbClr val="E7E6E6"/>
+      </a:lt2>
+      <a:accent1>
+        <a:srgbClr val="4472C4"/>
+      </a:accent1>
+      <a:accent2>
+        <a:srgbClr val="ED7D31"/>
+      </a:accent2>
+      <a:accent3>
+        <a:srgbClr val="A5A5A5"/>
+      </a:accent3>
+      <a:accent4>
+        <a:srgbClr val="FFC000"/>
+      </a:accent4>
+      <a:accent5>
+        <a:srgbClr val="5B9BD5"/>
+      </a:accent5>
+      <a:accent6>
+        <a:srgbClr val="70AD47"/>
+      </a:accent6>
+      <a:hlink>
+        <a:srgbClr val="0563C1"/>
+      </a:hlink>
+      <a:folHlink>
+        <a:srgbClr val="954F72"/>
+      </a:folHlink>
+    </a:clrScheme>
+    <a:fontScheme name="Office">
+      <a:majorFont>
+        <a:latin typeface="Calibri Light" panose="020F0302020204030204"/>
+        <a:ea typeface=""/>
+        <a:cs typeface=""/>
+        <a:font script="Jpan" typeface="游ゴシック Light"/>
+        <a:font script="Hang" typeface="맑은 고딕"/>
+        <a:font script="Hans" typeface="等线 Light"/>
+        <a:font script="Hant" typeface="新細明體"/>
+        <a:font script="Arab" typeface="Times New Roman"/>
+        <a:font script="Hebr" typeface="Times New Roman"/>
+        <a:font script="Thai" typeface="Angsana New"/>
+        <a:font script="Ethi" typeface="Nyala"/>
+        <a:font script="Beng" typeface="Vrinda"/>
+        <a:font script="Gujr" typeface="Shruti"/>
+        <a:font script="Khmr" typeface="MoolBoran"/>
+        <a:font script="Knda" typeface="Tunga"/>
+        <a:font script="Guru" typeface="Raavi"/>
+        <a:font script="Cans" typeface="Euphemia"/>
+        <a:font script="Cher" typeface="Plantagenet Cherokee"/>
+        <a:font script="Yiii" typeface="Microsoft Yi Baiti"/>
+        <a:font script="Tibt" typeface="Microsoft Himalaya"/>
+        <a:font script="Thaa" typeface="MV Boli"/>
+        <a:font script="Deva" typeface="Mangal"/>
+        <a:font script="Telu" typeface="Gautami"/>
+        <a:font script="Taml" typeface="Latha"/>
+        <a:font script="Syrc" typeface="Estrangelo Edessa"/>
+        <a:font script="Orya" typeface="Kalinga"/>
+        <a:font script="Mlym" typeface="Kartika"/>
+        <a:font script="Laoo" typeface="DokChampa"/>
+        <a:font script="Sinh" typeface="Iskoola Pota"/>
+        <a:font script="Mong" typeface="Mongolian Baiti"/>
+        <a:font script="Viet" typeface="Times New Roman"/>
+        <a:font script="Uigh" typeface="Microsoft Uighur"/>
+        <a:font script="Geor" typeface="Sylfaen"/>
+        <a:font script="Armn" typeface="Arial"/>
+        <a:font script="Bugi" typeface="Leelawadee UI"/>
+        <a:font script="Bopo" typeface="Microsoft JhengHei"/>
+        <a:font script="Java" typeface="Javanese Text"/>
+        <a:font script="Lisu" typeface="Segoe UI"/>
+        <a:font script="Mymr" typeface="Myanmar Text"/>
+        <a:font script="Nkoo" typeface="Ebrima"/>
+        <a:font script="Olck" typeface="Nirmala UI"/>
+        <a:font script="Osma" typeface="Ebrima"/>
+        <a:font script="Phag" typeface="Phagspa"/>
+        <a:font script="Syrn" typeface="Estrangelo Edessa"/>
+        <a:font script="Syrj" typeface="Estrangelo Edessa"/>
+        <a:font script="Syre" typeface="Estrangelo Edessa"/>
+        <a:font script="Sora" typeface="Nirmala UI"/>
+        <a:font script="Tale" typeface="Microsoft Tai Le"/>
+        <a:font script="Talu" typeface="Microsoft New Tai Lue"/>
+        <a:font script="Tfng" typeface="Ebrima"/>
+      </a:majorFont>
+      <a:minorFont>
+        <a:latin typeface="Calibri" panose="020F0502020204030204"/>
+        <a:ea typeface=""/>
+        <a:cs typeface=""/>
+        <a:font script="Jpan" typeface="游明朝"/>
+        <a:font script="Hang" typeface="맑은 고딕"/>
+        <a:font script="Hans" typeface="等线"/>
+        <a:font script="Hant" typeface="新細明體"/>
+        <a:font script="Arab" typeface="Arial"/>
+        <a:font script="Hebr" typeface="Arial"/>
+        <a:font script="Thai" typeface="Cordia New"/>
+        <a:font script="Ethi" typeface="Nyala"/>
+        <a:font script="Beng" typeface="Vrinda"/>
+        <a:font script="Gujr" typeface="Shruti"/>
+        <a:font script="Khmr" typeface="DaunPenh"/>
+        <a:font script="Knda" typeface="Tunga"/>
+        <a:font script="Guru" typeface="Raavi"/>
+        <a:font script="Cans" typeface="Euphemia"/>
+        <a:font script="Cher" typeface="Plantagenet Cherokee"/>
+        <a:font script="Yiii" typeface="Microsoft Yi Baiti"/>
+        <a:font script="Tibt" typeface="Microsoft Himalaya"/>
+        <a:font script="Thaa" typeface="MV Boli"/>
+        <a:font script="Deva" typeface="Mangal"/>
+        <a:font script="Telu" typeface="Gautami"/>
+        <a:font script="Taml" typeface="Latha"/>
+        <a:font script="Syrc" typeface="Estrangelo Edessa"/>
+        <a:font script="Orya" typeface="Kalinga"/>
+        <a:font script="Mlym" typeface="Kartika"/>
+        <a:font script="Laoo" typeface="DokChampa"/>
+        <a:font script="Sinh" typeface="Iskoola Pota"/>
+        <a:font script="Mong" typeface="Mongolian Baiti"/>
+        <a:font script="Viet" typeface="Arial"/>
+        <a:font script="Uigh" typeface="Microsoft Uighur"/>
+        <a:font script="Geor" typeface="Sylfaen"/>
+        <a:font script="Armn" typeface="Arial"/>
+        <a:font script="Bugi" typeface="Leelawadee UI"/>
+        <a:font script="Bopo" typeface="Microsoft JhengHei"/>
+        <a:font script="Java" typeface="Javanese Text"/>
+        <a:font script="Lisu" typeface="Segoe UI"/>
+        <a:font script="Mymr" typeface="Myanmar Text"/>
+        <a:font script="Nkoo" typeface="Ebrima"/>
+        <a:font script="Olck" typeface="Nirmala UI"/>
+        <a:font script="Osma" typeface="Ebrima"/>
+        <a:font script="Phag" typeface="Phagspa"/>
+        <a:font script="Syrn" typeface="Estrangelo Edessa"/>
+        <a:font script="Syrj" typeface="Estrangelo Edessa"/>
+        <a:font script="Syre" typeface="Estrangelo Edessa"/>
+        <a:font script="Sora" typeface="Nirmala UI"/>
+        <a:font script="Tale" typeface="Microsoft Tai Le"/>
+        <a:font script="Talu" typeface="Microsoft New Tai Lue"/>
+        <a:font script="Tfng" typeface="Ebrima"/>
+      </a:minorFont>
+    </a:fontScheme>
+    <a:fmtScheme name="Office">
+      <a:fillStyleLst>
+        <a:solidFill>
+          <a:schemeClr val="phClr"/>
+        </a:solidFill>
+        <a:gradFill rotWithShape="true">
+          <a:gsLst>
+            <a:gs pos="0">
+              <a:schemeClr val="phClr">
+                <a:lumMod val="110000"/>
+                <a:satMod val="105000"/>
+                <a:tint val="67000"/>
+              </a:schemeClr>
+            </a:gs>
+            <a:gs pos="50000">
+              <a:schemeClr val="phClr">
+                <a:lumMod val="105000"/>
+                <a:satMod val="103000"/>
+                <a:tint val="73000"/>
+              </a:schemeClr>
+            </a:gs>
+            <a:gs pos="100000">
+              <a:schemeClr val="phClr">
+                <a:lumMod val="105000"/>
+                <a:satMod val="109000"/>
+                <a:tint val="81000"/>
+              </a:schemeClr>
+            </a:gs>
+          </a:gsLst>
+          <a:lin ang="5400000" scaled="false"/>
+        </a:gradFill>
+        <a:gradFill rotWithShape="true">
+          <a:gsLst>
+            <a:gs pos="0">
+              <a:schemeClr val="phClr">
+                <a:satMod val="103000"/>
+                <a:lumMod val="102000"/>
+                <a:tint val="94000"/>
+              </a:schemeClr>
+            </a:gs>
+            <a:gs pos="50000">
+              <a:schemeClr val="phClr">
+                <a:satMod val="110000"/>
+                <a:lumMod val="100000"/>
+                <a:shade val="100000"/>
+              </a:schemeClr>
+            </a:gs>
+            <a:gs pos="100000">
+              <a:schemeClr val="phClr">
+                <a:lumMod val="99000"/>
+                <a:satMod val="120000"/>
+                <a:shade val="78000"/>
+              </a:schemeClr>
+            </a:gs>
+          </a:gsLst>
+          <a:lin ang="5400000" scaled="false"/>
+        </a:gradFill>
+      </a:fillStyleLst>
+      <a:lnStyleLst>
+        <a:ln w="6350" cap="flat" cmpd="sng" algn="ctr">
+          <a:solidFill>
+            <a:schemeClr val="phClr"/>
+          </a:solidFill>
+          <a:prstDash val="solid"/>
+          <a:miter lim="800000"/>
+        </a:ln>
+        <a:ln w="12700" cap="flat" cmpd="sng" algn="ctr">
+          <a:solidFill>
+            <a:schemeClr val="phClr"/>
+          </a:solidFill>
+          <a:prstDash val="solid"/>
+          <a:miter lim="800000"/>
+        </a:ln>
+        <a:ln w="19050" cap="flat" cmpd="sng" algn="ctr">
+          <a:solidFill>
+            <a:schemeClr val="phClr"/>
+          </a:solidFill>
+          <a:prstDash val="solid"/>
+          <a:miter lim="800000"/>
+        </a:ln>
+      </a:lnStyleLst>
+      <a:effectStyleLst>
+        <a:effectStyle>
+          <a:effectLst/>
+        </a:effectStyle>
+        <a:effectStyle>
+          <a:effectLst/>
+        </a:effectStyle>
+        <a:effectStyle>
+          <a:effectLst>
+            <a:outerShdw blurRad="57150" dist="19050" dir="5400000" algn="ctr" rotWithShape="false">
+              <a:srgbClr val="000000">
+                <a:alpha val="63000"/>
+              </a:srgbClr>
+            </a:outerShdw>
+          </a:effectLst>
+        </a:effectStyle>
+      </a:effectStyleLst>
+      <a:bgFillStyleLst>
+        <a:solidFill>
+          <a:schemeClr val="phClr"/>
+        </a:solidFill>
+        <a:solidFill>
+          <a:schemeClr val="phClr">
+            <a:tint val="95000"/>
+            <a:satMod val="170000"/>
+          </a:schemeClr>
+        </a:solidFill>
+        <a:gradFill rotWithShape="true">
+          <a:gsLst>
+            <a:gs pos="0">
+              <a:schemeClr val="phClr">
+                <a:tint val="93000"/>
+                <a:satMod val="150000"/>
+                <a:shade val="98000"/>
+                <a:lumMod val="102000"/>
+              </a:schemeClr>
+            </a:gs>
+            <a:gs pos="50000">
+              <a:schemeClr val="phClr">
+                <a:tint val="98000"/>
+                <a:satMod val="130000"/>
+                <a:shade val="90000"/>
+                <a:lumMod val="103000"/>
+              </a:schemeClr>
+            </a:gs>
+            <a:gs pos="100000">
+              <a:schemeClr val="phClr">
+                <a:shade val="63000"/>
+                <a:satMod val="120000"/>
+              </a:schemeClr>
+            </a:gs>
+          </a:gsLst>
+          <a:lin ang="5400000" scaled="false"/>
+        </a:gradFill>
+      </a:bgFillStyleLst>
+    </a:fmtScheme>
+  </a:themeElements>
+  <a:objectDefaults/>
+  <a:extraClrSchemeLst/>
+</a:theme>
 </file>
</xml_diff>